<commit_message>
Updating some text on the site, giving it a new favicon and adding a pdf version of my resume
</commit_message>
<xml_diff>
--- a/public/Bret Pehrson.docx
+++ b/public/Bret Pehrson.docx
@@ -61,7 +61,7 @@
           <w:sz w:val="18"/>
           <w:szCs w:val="18"/>
         </w:rPr>
-        <w:t xml:space="preserve">. </w:t>
+        <w:t xml:space="preserve"> </w:t>
       </w:r>
       <w:r>
         <w:rPr>
@@ -69,7 +69,7 @@
           <w:sz w:val="18"/>
           <w:szCs w:val="18"/>
         </w:rPr>
-        <w:t>|</w:t>
+        <w:t xml:space="preserve"> </w:t>
       </w:r>
       <w:r>
         <w:rPr>
@@ -77,7 +77,23 @@
           <w:sz w:val="18"/>
           <w:szCs w:val="18"/>
         </w:rPr>
-        <w:t xml:space="preserve">. </w:t>
+        <w:t>|</w:t>
+      </w:r>
+      <w:r>
+        <w:rPr>
+          <w:color w:val="1155CC"/>
+          <w:sz w:val="18"/>
+          <w:szCs w:val="18"/>
+        </w:rPr>
+        <w:t xml:space="preserve"> </w:t>
+      </w:r>
+      <w:r>
+        <w:rPr>
+          <w:color w:val="1155CC"/>
+          <w:sz w:val="18"/>
+          <w:szCs w:val="18"/>
+        </w:rPr>
+        <w:t xml:space="preserve"> </w:t>
       </w:r>
       <w:r>
         <w:rPr>
@@ -160,16 +176,8 @@
         <w:t>, VBA</w:t>
       </w:r>
       <w:r>
-        <w:t>, VBScript, JavaScript, AJAX, T-</w:t>
-      </w:r>
-      <w:proofErr w:type="spellStart"/>
-      <w:r>
-        <w:t>SQL</w:t>
-      </w:r>
-      <w:r>
-        <w:t>q</w:t>
-      </w:r>
-      <w:proofErr w:type="spellEnd"/>
+        <w:t>, VBScript, JavaScript, AJAX, T-SQL</w:t>
+      </w:r>
     </w:p>
     <w:p>
       <w:pPr>
@@ -240,46 +248,87 @@
           <w:tab w:val="right" w:pos="9360"/>
         </w:tabs>
         <w:spacing w:before="140" w:after="20"/>
-      </w:pPr>
-      <w:r>
         <w:rPr>
           <w:b/>
           <w:bCs/>
           <w:sz w:val="22"/>
           <w:szCs w:val="22"/>
         </w:rPr>
-        <w:t>University of Utah — UIT, Northstar Team</w:t>
-      </w:r>
-      <w:r>
-        <w:rPr>
-          <w:color w:val="444444"/>
-        </w:rPr>
-        <w:tab/>
-        <w:t>Salt Lake City, UT</w:t>
-      </w:r>
-    </w:p>
-    <w:p>
-      <w:pPr>
-        <w:tabs>
-          <w:tab w:val="right" w:pos="9360"/>
-        </w:tabs>
-        <w:spacing w:after="40"/>
-      </w:pPr>
-      <w:r>
-        <w:rPr>
-          <w:b/>
-          <w:bCs/>
-          <w:i/>
-          <w:iCs/>
-          <w:color w:val="1F3864"/>
-        </w:rPr>
-        <w:t>Software Developer IV (Senior Level)</w:t>
-      </w:r>
-      <w:r>
-        <w:rPr>
-          <w:color w:val="444444"/>
-        </w:rPr>
-        <w:tab/>
+      </w:pPr>
+      <w:r>
+        <w:rPr>
+          <w:b/>
+          <w:bCs/>
+          <w:sz w:val="22"/>
+          <w:szCs w:val="22"/>
+        </w:rPr>
+        <w:t>Utah System of Higher Education (USHE) — Salt Lake City, UT</w:t>
+      </w:r>
+    </w:p>
+    <w:p>
+      <w:pPr>
+        <w:spacing w:before="40" w:after="40"/>
+        <w:ind w:left="280"/>
+        <w:rPr>
+          <w:b/>
+          <w:bCs/>
+          <w:sz w:val="22"/>
+          <w:szCs w:val="22"/>
+        </w:rPr>
+      </w:pPr>
+      <w:r>
+        <w:rPr>
+          <w:b/>
+          <w:bCs/>
+          <w:sz w:val="22"/>
+          <w:szCs w:val="22"/>
+        </w:rPr>
+        <w:t>Software Developer IV (Senior Level) — University of Utah UIT / Northstar Team</w:t>
+      </w:r>
+      <w:r>
+        <w:rPr>
+          <w:b/>
+          <w:bCs/>
+          <w:sz w:val="22"/>
+          <w:szCs w:val="22"/>
+        </w:rPr>
+        <w:t xml:space="preserve"> (</w:t>
+      </w:r>
+      <w:proofErr w:type="spellStart"/>
+      <w:r>
+        <w:rPr>
+          <w:b/>
+          <w:bCs/>
+          <w:sz w:val="22"/>
+          <w:szCs w:val="22"/>
+        </w:rPr>
+        <w:t>UTech</w:t>
+      </w:r>
+      <w:proofErr w:type="spellEnd"/>
+      <w:r>
+        <w:rPr>
+          <w:b/>
+          <w:bCs/>
+          <w:sz w:val="22"/>
+          <w:szCs w:val="22"/>
+        </w:rPr>
+        <w:t>)</w:t>
+      </w:r>
+    </w:p>
+    <w:p>
+      <w:pPr>
+        <w:spacing w:before="40" w:after="40"/>
+        <w:ind w:left="280"/>
+        <w:rPr>
+          <w:sz w:val="21"/>
+          <w:szCs w:val="21"/>
+        </w:rPr>
+      </w:pPr>
+      <w:r>
+        <w:rPr>
+          <w:sz w:val="21"/>
+          <w:szCs w:val="21"/>
+        </w:rPr>
         <w:t>02/2021 – Present</w:t>
       </w:r>
     </w:p>
@@ -350,69 +399,41 @@
     </w:p>
     <w:p>
       <w:pPr>
-        <w:tabs>
-          <w:tab w:val="right" w:pos="9360"/>
-        </w:tabs>
-        <w:spacing w:before="140" w:after="20"/>
-      </w:pPr>
-      <w:r>
+        <w:pStyle w:val="ListParagraph"/>
+        <w:spacing w:before="40" w:after="40"/>
+        <w:ind w:left="540"/>
+      </w:pPr>
+    </w:p>
+    <w:p>
+      <w:pPr>
+        <w:pStyle w:val="ListParagraph"/>
+        <w:spacing w:before="40" w:after="40"/>
+        <w:ind w:left="280"/>
         <w:rPr>
           <w:b/>
           <w:bCs/>
           <w:sz w:val="22"/>
           <w:szCs w:val="22"/>
         </w:rPr>
-        <w:t>Utah Higher Education Assistance Authority (UHEAA)</w:t>
-      </w:r>
-      <w:r>
-        <w:rPr>
-          <w:color w:val="444444"/>
-        </w:rPr>
-        <w:tab/>
-        <w:t>Salt Lake City, UT</w:t>
-      </w:r>
-    </w:p>
-    <w:p>
-      <w:pPr>
-        <w:tabs>
-          <w:tab w:val="right" w:pos="9360"/>
-        </w:tabs>
-        <w:spacing w:after="40"/>
-      </w:pPr>
-      <w:r>
-        <w:rPr>
-          <w:b/>
-          <w:bCs/>
-          <w:i/>
-          <w:iCs/>
-          <w:color w:val="1F3864"/>
-        </w:rPr>
-        <w:t>Software Developer II</w:t>
-      </w:r>
-      <w:r>
-        <w:rPr>
-          <w:color w:val="444444"/>
-        </w:rPr>
-        <w:tab/>
-        <w:t>10/2008 – 1</w:t>
-      </w:r>
-      <w:r>
-        <w:rPr>
-          <w:color w:val="444444"/>
-        </w:rPr>
-        <w:t>2</w:t>
-      </w:r>
-      <w:r>
-        <w:rPr>
-          <w:color w:val="444444"/>
-        </w:rPr>
-        <w:t>/202</w:t>
-      </w:r>
-      <w:r>
-        <w:rPr>
-          <w:color w:val="444444"/>
-        </w:rPr>
-        <w:t>0</w:t>
+      </w:pPr>
+      <w:r>
+        <w:rPr>
+          <w:b/>
+          <w:bCs/>
+          <w:sz w:val="22"/>
+          <w:szCs w:val="22"/>
+        </w:rPr>
+        <w:t>Software Developer II — Utah Higher Education Assistance Authority (UHEAA)</w:t>
+      </w:r>
+    </w:p>
+    <w:p>
+      <w:pPr>
+        <w:pStyle w:val="ListParagraph"/>
+        <w:spacing w:before="40" w:after="40"/>
+        <w:ind w:left="280"/>
+      </w:pPr>
+      <w:r>
+        <w:t>10/2008 – 12/2020</w:t>
       </w:r>
     </w:p>
     <w:p>
@@ -438,7 +459,7 @@
         <w:spacing w:before="40" w:after="40"/>
       </w:pPr>
       <w:r>
-        <w:t>Engineered scalable backend processing systems supporting over 1 million student loans per month, with a focus on performance optimization, reliability, and efficient resource utilization.</w:t>
+        <w:t>Designed and implemented an enterprise identity and access management system providing centralized user provisioning, authentication, and access control across multiple applications using LDAP and role-based authorization models.</w:t>
       </w:r>
     </w:p>
     <w:p>
@@ -451,7 +472,7 @@
         <w:spacing w:before="40" w:after="40"/>
       </w:pPr>
       <w:r>
-        <w:t>Built high-volume batch letter processing system using lazy-loading to ensure reliable output across large print runs.</w:t>
+        <w:t>Engineered scalable backend processing systems supporting over 1 million student loans per month, with a focus on performance optimization, reliability, and efficient resource utilization.</w:t>
       </w:r>
     </w:p>
     <w:p>
@@ -464,7 +485,7 @@
         <w:spacing w:before="40" w:after="40"/>
       </w:pPr>
       <w:r>
-        <w:t>Designed and implemented centralized error handling infrastructure for departmental scripts — including logging, alerting, and historical reporting — keeping all teams informed of production issues.</w:t>
+        <w:t>Built high-volume batch letter processing system using lazy-loading to ensure reliable output across large print runs.</w:t>
       </w:r>
     </w:p>
     <w:p>
@@ -477,7 +498,7 @@
         <w:spacing w:before="40" w:after="40"/>
       </w:pPr>
       <w:r>
-        <w:t>Worked directly with department managers to design, build, and maintain mission-critical internal applications.</w:t>
+        <w:t>Designed and implemented centralized error handling infrastructure for departmental scripts — including logging, alerting, and historical reporting — keeping all teams informed of production issues.</w:t>
       </w:r>
     </w:p>
     <w:p>
@@ -555,6 +576,9 @@
         <w:spacing w:after="80"/>
       </w:pPr>
       <w:r>
+        <w:t xml:space="preserve">    </w:t>
+      </w:r>
+      <w:r>
         <w:t>B.S. Computer Science  |  GPA: 3.1</w:t>
       </w:r>
       <w:r>
@@ -597,6 +621,9 @@
         <w:spacing w:after="80"/>
       </w:pPr>
       <w:r>
+        <w:t xml:space="preserve">    </w:t>
+      </w:r>
+      <w:r>
         <w:t>A.A.S. Mathematics Education  |  GPA: 3.2</w:t>
       </w:r>
       <w:r>
@@ -609,7 +636,7 @@
     </w:p>
     <w:sectPr>
       <w:pgSz w:w="12240" w:h="15840"/>
-      <w:pgMar w:top="1080" w:right="1260" w:bottom="1080" w:left="1260" w:header="708" w:footer="708" w:gutter="0"/>
+      <w:pgMar w:top="729" w:right="1260" w:bottom="1080" w:left="1260" w:header="708" w:footer="708" w:gutter="0"/>
       <w:cols w:space="720"/>
       <w:docGrid w:linePitch="360"/>
     </w:sectPr>

</xml_diff>

<commit_message>
Removing address from resume
</commit_message>
<xml_diff>
--- a/public/Bret Pehrson.docx
+++ b/public/Bret Pehrson.docx
@@ -22,81 +22,14 @@
       <w:pPr>
         <w:spacing w:after="40"/>
         <w:jc w:val="center"/>
+      </w:pPr>
+      <w:r>
         <w:rPr>
           <w:color w:val="444444"/>
           <w:sz w:val="22"/>
           <w:szCs w:val="22"/>
         </w:rPr>
-      </w:pPr>
-      <w:r>
-        <w:rPr>
-          <w:color w:val="444444"/>
-          <w:sz w:val="22"/>
-          <w:szCs w:val="22"/>
-        </w:rPr>
         <w:t>Senior .NET Software Developer</w:t>
-      </w:r>
-    </w:p>
-    <w:p>
-      <w:pPr>
-        <w:spacing w:after="40"/>
-        <w:jc w:val="center"/>
-      </w:pPr>
-      <w:r>
-        <w:rPr>
-          <w:color w:val="444444"/>
-          <w:sz w:val="22"/>
-          <w:szCs w:val="22"/>
-        </w:rPr>
-        <w:t>35 E 100 S #303, S</w:t>
-      </w:r>
-      <w:r>
-        <w:rPr>
-          <w:color w:val="444444"/>
-          <w:sz w:val="22"/>
-          <w:szCs w:val="22"/>
-        </w:rPr>
-        <w:t xml:space="preserve">alt </w:t>
-      </w:r>
-      <w:r>
-        <w:rPr>
-          <w:color w:val="444444"/>
-          <w:sz w:val="22"/>
-          <w:szCs w:val="22"/>
-        </w:rPr>
-        <w:t>L</w:t>
-      </w:r>
-      <w:r>
-        <w:rPr>
-          <w:color w:val="444444"/>
-          <w:sz w:val="22"/>
-          <w:szCs w:val="22"/>
-        </w:rPr>
-        <w:t xml:space="preserve">ake </w:t>
-      </w:r>
-      <w:r>
-        <w:rPr>
-          <w:color w:val="444444"/>
-          <w:sz w:val="22"/>
-          <w:szCs w:val="22"/>
-        </w:rPr>
-        <w:t>C</w:t>
-      </w:r>
-      <w:r>
-        <w:rPr>
-          <w:color w:val="444444"/>
-          <w:sz w:val="22"/>
-          <w:szCs w:val="22"/>
-        </w:rPr>
-        <w:t>ity</w:t>
-      </w:r>
-      <w:r>
-        <w:rPr>
-          <w:color w:val="444444"/>
-          <w:sz w:val="22"/>
-          <w:szCs w:val="22"/>
-        </w:rPr>
-        <w:t>, UT. 84111 | 801-921-8125</w:t>
       </w:r>
     </w:p>
     <w:p>
@@ -152,7 +85,7 @@
           <w:sz w:val="18"/>
           <w:szCs w:val="18"/>
         </w:rPr>
-        <w:t>github.c</w:t>
+        <w:t>github.com/</w:t>
       </w:r>
       <w:proofErr w:type="spellStart"/>
       <w:r>
@@ -161,7 +94,7 @@
           <w:sz w:val="18"/>
           <w:szCs w:val="18"/>
         </w:rPr>
-        <w:t>om/bretp</w:t>
+        <w:t>bretp</w:t>
       </w:r>
       <w:r>
         <w:rPr>
@@ -169,17 +102,9 @@
           <w:sz w:val="18"/>
           <w:szCs w:val="18"/>
         </w:rPr>
-        <w:t>ehr</w:t>
+        <w:t>ehrson</w:t>
       </w:r>
       <w:proofErr w:type="spellEnd"/>
-      <w:r>
-        <w:rPr>
-          <w:color w:val="1155CC"/>
-          <w:sz w:val="18"/>
-          <w:szCs w:val="18"/>
-        </w:rPr>
-        <w:t>son</w:t>
-      </w:r>
       <w:r>
         <w:rPr>
           <w:color w:val="1155CC"/>

</xml_diff>

<commit_message>
Updating dates on resume
</commit_message>
<xml_diff>
--- a/public/Bret Pehrson.docx
+++ b/public/Bret Pehrson.docx
@@ -427,7 +427,21 @@
           <w:sz w:val="21"/>
           <w:szCs w:val="21"/>
         </w:rPr>
-        <w:t xml:space="preserve">02/2021 – </w:t>
+        <w:t>02/202</w:t>
+      </w:r>
+      <w:r>
+        <w:rPr>
+          <w:sz w:val="21"/>
+          <w:szCs w:val="21"/>
+        </w:rPr>
+        <w:t>2</w:t>
+      </w:r>
+      <w:r>
+        <w:rPr>
+          <w:sz w:val="21"/>
+          <w:szCs w:val="21"/>
+        </w:rPr>
+        <w:t xml:space="preserve"> – </w:t>
       </w:r>
       <w:r>
         <w:rPr>
@@ -609,7 +623,10 @@
         <w:t xml:space="preserve">  </w:t>
       </w:r>
       <w:r>
-        <w:t>10/2008 – 12/2020</w:t>
+        <w:t>10/2008 – 12/202</w:t>
+      </w:r>
+      <w:r>
+        <w:t>1</w:t>
       </w:r>
     </w:p>
     <w:p>

</xml_diff>

<commit_message>
Updating resume and resume page
</commit_message>
<xml_diff>
--- a/public/Bret Pehrson.docx
+++ b/public/Bret Pehrson.docx
@@ -22,14 +22,41 @@
       <w:pPr>
         <w:spacing w:after="40"/>
         <w:jc w:val="center"/>
-      </w:pPr>
-      <w:r>
         <w:rPr>
           <w:color w:val="444444"/>
           <w:sz w:val="22"/>
           <w:szCs w:val="22"/>
         </w:rPr>
+      </w:pPr>
+      <w:r>
+        <w:rPr>
+          <w:color w:val="444444"/>
+          <w:sz w:val="22"/>
+          <w:szCs w:val="22"/>
+        </w:rPr>
         <w:t>Senior .NET Software Developer</w:t>
+      </w:r>
+    </w:p>
+    <w:p>
+      <w:pPr>
+        <w:spacing w:after="40"/>
+        <w:jc w:val="center"/>
+      </w:pPr>
+      <w:r>
+        <w:rPr>
+          <w:color w:val="444444"/>
+          <w:sz w:val="22"/>
+          <w:szCs w:val="22"/>
+        </w:rPr>
+        <w:t>Salt Lake City, U</w:t>
+      </w:r>
+      <w:r>
+        <w:rPr>
+          <w:color w:val="444444"/>
+          <w:sz w:val="22"/>
+          <w:szCs w:val="22"/>
+        </w:rPr>
+        <w:t>T</w:t>
       </w:r>
     </w:p>
     <w:p>
@@ -43,7 +70,43 @@
           <w:sz w:val="18"/>
           <w:szCs w:val="18"/>
         </w:rPr>
-        <w:t>linkedin.com/in/bretpehrson | github.com/bretpehrson | bretpehrson.com</w:t>
+        <w:t>linkedin.com/in/</w:t>
+      </w:r>
+      <w:proofErr w:type="spellStart"/>
+      <w:r>
+        <w:rPr>
+          <w:color w:val="1155CC"/>
+          <w:sz w:val="18"/>
+          <w:szCs w:val="18"/>
+        </w:rPr>
+        <w:t>bretpehrson</w:t>
+      </w:r>
+      <w:proofErr w:type="spellEnd"/>
+      <w:r>
+        <w:rPr>
+          <w:color w:val="1155CC"/>
+          <w:sz w:val="18"/>
+          <w:szCs w:val="18"/>
+        </w:rPr>
+        <w:t xml:space="preserve"> | github.com/</w:t>
+      </w:r>
+      <w:proofErr w:type="spellStart"/>
+      <w:r>
+        <w:rPr>
+          <w:color w:val="1155CC"/>
+          <w:sz w:val="18"/>
+          <w:szCs w:val="18"/>
+        </w:rPr>
+        <w:t>bretpehrson</w:t>
+      </w:r>
+      <w:proofErr w:type="spellEnd"/>
+      <w:r>
+        <w:rPr>
+          <w:color w:val="1155CC"/>
+          <w:sz w:val="18"/>
+          <w:szCs w:val="18"/>
+        </w:rPr>
+        <w:t xml:space="preserve"> | bretpehrson.com</w:t>
       </w:r>
     </w:p>
     <w:p>
@@ -142,7 +205,10 @@
           <w:rFonts w:eastAsia="Times New Roman"/>
           <w:color w:val="auto"/>
         </w:rPr>
-        <w:t>including Azure Functions, Azure application hosting, and CI/CD pipelines using GitHub Actions. Key contributor on a migration from a legacy WPF/WCF monolith to a modern Blazor + REST API architecture with OAuth security and Docker hosting. Also builds Angular and React/Next.js sites with serverless Azure backends for small businesses, leveraging AI-assisted development (GitHub Copilot with Claude models, agent mode) to accelerate delivery.</w:t>
+        <w:t xml:space="preserve">including Azure Functions, Azure application hosting, and CI/CD pipelines using GitHub Actions. Key contributor on a migration from a legacy WPF/WCF monolith to a modern Blazor + REST API architecture with OAuth security and Docker hosting. </w:t>
+      </w:r>
+      <w:r>
+        <w:t>Concurrently delivers full-stack freelance solutions (React/Next.js, Angular, serverless Azure) for small businesses, leveraging AI-assisted development to accelerate delivery.</w:t>
       </w:r>
     </w:p>
     <w:p>
@@ -223,8 +289,13 @@
         <w:t>Azure App Service, Azure Functions (Serverless), GitHub Actions (CI/CD), Docker, IIS 10, Windows Server, Visual Studio</w:t>
       </w:r>
       <w:r>
-        <w:t>, VSCode</w:t>
-      </w:r>
+        <w:t xml:space="preserve">, </w:t>
+      </w:r>
+      <w:proofErr w:type="spellStart"/>
+      <w:r>
+        <w:t>VSCode</w:t>
+      </w:r>
+      <w:proofErr w:type="spellEnd"/>
       <w:r>
         <w:t>, GitHub, JSON, GitHub Copilot (Agent Mode), Claude AI</w:t>
       </w:r>
@@ -370,7 +441,19 @@
         <w:t>Member of a small four-person team responsible for a large, complex monolithic enterprise application built on WPF and WCF</w:t>
       </w:r>
       <w:r>
-        <w:t xml:space="preserve"> with C# and .Net framework 4.8.1</w:t>
+        <w:t xml:space="preserve"> with C# and .N</w:t>
+      </w:r>
+      <w:r>
+        <w:t>ET</w:t>
+      </w:r>
+      <w:r>
+        <w:t xml:space="preserve"> </w:t>
+      </w:r>
+      <w:r>
+        <w:t>F</w:t>
+      </w:r>
+      <w:r>
+        <w:t>ramework 4.8.1</w:t>
       </w:r>
       <w:r>
         <w:t>, learning the system from the inside out and driving improvements independently.</w:t>
@@ -389,7 +472,13 @@
         <w:t>Played a key role in modernizing the legacy WPF/WCF platform, incrementally migrating it to a Blazor web application with a REST API layer, OAuth 2.0 security, Entity Framework ORM, and Docker-based hosting</w:t>
       </w:r>
       <w:r>
-        <w:t xml:space="preserve"> using the latest version of C# and .Net Core 10</w:t>
+        <w:t xml:space="preserve"> using the latest version of C# and .N</w:t>
+      </w:r>
+      <w:r>
+        <w:t>ET</w:t>
+      </w:r>
+      <w:r>
+        <w:t xml:space="preserve"> Core 10</w:t>
       </w:r>
       <w:r>
         <w:t>.</w:t>
@@ -405,7 +494,25 @@
         <w:spacing w:before="20" w:after="20"/>
       </w:pPr>
       <w:r>
-        <w:t>Architect and hands-on implementer of new REST API layer replacing WCF backend, designing endpoints, security model, and data access patterns while maintaining backward compatibility with legacy clients; set up GitHub Actions pipelines for automated build and deployment.</w:t>
+        <w:t>Architect</w:t>
+      </w:r>
+      <w:r>
+        <w:t>ed</w:t>
+      </w:r>
+      <w:r>
+        <w:t xml:space="preserve"> and implement</w:t>
+      </w:r>
+      <w:r>
+        <w:t>ed</w:t>
+      </w:r>
+      <w:r>
+        <w:t xml:space="preserve"> </w:t>
+      </w:r>
+      <w:r>
+        <w:t>a ne</w:t>
+      </w:r>
+      <w:r>
+        <w:t>w REST API layer replacing WCF backend, designing endpoints, security model, and data access patterns while maintaining backward compatibility with legacy clients; set up GitHub Actions pipelines for automated build and deployment.</w:t>
       </w:r>
     </w:p>
     <w:p>
@@ -418,7 +525,46 @@
         <w:spacing w:before="20" w:after="20"/>
       </w:pPr>
       <w:r>
-        <w:t>Own and maintain complex IIS-hosted ASP.NET MVC application supporting the existing WCF backend across Windows Server environments.</w:t>
+        <w:t>Own</w:t>
+      </w:r>
+      <w:r>
+        <w:t>ed</w:t>
+      </w:r>
+      <w:r>
+        <w:t xml:space="preserve"> and maintain</w:t>
+      </w:r>
+      <w:r>
+        <w:t>ed</w:t>
+      </w:r>
+      <w:r>
+        <w:t xml:space="preserve"> </w:t>
+      </w:r>
+      <w:r>
+        <w:t xml:space="preserve">a </w:t>
+      </w:r>
+      <w:r>
+        <w:t>complex IIS-hosted ASP.NET MVC application supporting the existing WCF backend across Windows Server environments.</w:t>
+      </w:r>
+    </w:p>
+    <w:p>
+      <w:pPr>
+        <w:pStyle w:val="ListParagraph"/>
+        <w:numPr>
+          <w:ilvl w:val="0"/>
+          <w:numId w:val="2"/>
+        </w:numPr>
+        <w:spacing w:after="48"/>
+        <w:rPr>
+          <w:color w:val="000000" w:themeColor="text1"/>
+          <w:sz w:val="18"/>
+          <w:szCs w:val="18"/>
+        </w:rPr>
+      </w:pPr>
+      <w:r>
+        <w:rPr>
+          <w:color w:val="000000" w:themeColor="text1"/>
+        </w:rPr>
+        <w:t>Performed SQL Server performance analysis and query optimization across 100+ queries including queries reduced from 10-minute timeouts to sub-15-second execution times.</w:t>
       </w:r>
     </w:p>
     <w:p>
@@ -431,7 +577,28 @@
         <w:spacing w:before="20" w:after="20"/>
       </w:pPr>
       <w:r>
-        <w:t>Perform SQL Server performance analysis, query optimization, and schema navigation to ensure stability across enterprise data operations.</w:t>
+        <w:t>Mentored junior developers</w:t>
+      </w:r>
+      <w:r>
+        <w:t>, o</w:t>
+      </w:r>
+      <w:r>
+        <w:t>nboard</w:t>
+      </w:r>
+      <w:r>
+        <w:t>ed</w:t>
+      </w:r>
+      <w:r>
+        <w:t xml:space="preserve"> new team members</w:t>
+      </w:r>
+      <w:r>
+        <w:t xml:space="preserve">, and trained staff on modern C# and .NET Core </w:t>
+      </w:r>
+      <w:r>
+        <w:t>updates</w:t>
+      </w:r>
+      <w:r>
+        <w:t>.</w:t>
       </w:r>
     </w:p>
     <w:p>
@@ -444,10 +611,7 @@
         <w:spacing w:before="20" w:after="20"/>
       </w:pPr>
       <w:r>
-        <w:t>Mentored junior developers and helped onboard and train new team members on the codebase and team practices.</w:t>
-      </w:r>
-      <w:r>
-        <w:t xml:space="preserve"> Trained on new C# and .Net Core updates.</w:t>
+        <w:t>Worked with Confluence and Jira to document system architecture, API endpoints, and development processes for team knowledge sharing and onboarding.</w:t>
       </w:r>
     </w:p>
     <w:p>
@@ -573,7 +737,13 @@
         <w:t>Designed and built a company-wide ticketing system to create, update, and maintain change records across all organizational processes</w:t>
       </w:r>
       <w:r>
-        <w:t xml:space="preserve"> in C# using .Net Framework 4.8.1</w:t>
+        <w:t xml:space="preserve"> in C# using .N</w:t>
+      </w:r>
+      <w:r>
+        <w:t>ET</w:t>
+      </w:r>
+      <w:r>
+        <w:t xml:space="preserve"> Framework</w:t>
       </w:r>
       <w:r>
         <w:t>.</w:t>
@@ -626,22 +796,16 @@
           <w:numId w:val="2"/>
         </w:numPr>
         <w:spacing w:before="20" w:after="20"/>
+        <w:rPr>
+          <w:b/>
+          <w:bCs/>
+          <w:color w:val="1F3864"/>
+          <w:sz w:val="24"/>
+          <w:szCs w:val="24"/>
+        </w:rPr>
       </w:pPr>
       <w:r>
         <w:t>Designed and implemented centralized error handling infrastructure for departmental scripts, including logging, alerting, and historical reporting, to keep all teams informed of production issues.</w:t>
-      </w:r>
-    </w:p>
-    <w:p>
-      <w:pPr>
-        <w:pStyle w:val="ListParagraph"/>
-        <w:numPr>
-          <w:ilvl w:val="0"/>
-          <w:numId w:val="2"/>
-        </w:numPr>
-        <w:spacing w:before="20" w:after="20"/>
-      </w:pPr>
-      <w:r>
-        <w:t>Mentored and trained new developers on best practices, modern coding standards, and object-oriented design principles.</w:t>
       </w:r>
     </w:p>
     <w:p>
@@ -650,6 +814,8 @@
           <w:bottom w:val="single" w:sz="8" w:space="2" w:color="1F3864"/>
         </w:pBdr>
         <w:spacing w:before="120" w:after="40"/>
+      </w:pPr>
+      <w:r>
         <w:rPr>
           <w:b/>
           <w:bCs/>
@@ -657,23 +823,7 @@
           <w:sz w:val="24"/>
           <w:szCs w:val="24"/>
         </w:rPr>
-      </w:pPr>
-    </w:p>
-    <w:p>
-      <w:pPr>
-        <w:pBdr>
-          <w:bottom w:val="single" w:sz="8" w:space="2" w:color="1F3864"/>
-        </w:pBdr>
-        <w:spacing w:before="120" w:after="40"/>
-      </w:pPr>
-      <w:r>
-        <w:rPr>
-          <w:b/>
-          <w:bCs/>
-          <w:color w:val="1F3864"/>
-          <w:sz w:val="24"/>
-          <w:szCs w:val="24"/>
-        </w:rPr>
+        <w:lastRenderedPageBreak/>
         <w:t>EDUCATION</w:t>
       </w:r>
     </w:p>
@@ -683,82 +833,45 @@
           <w:tab w:val="right" w:pos="9360"/>
         </w:tabs>
         <w:spacing w:before="120" w:after="20"/>
-      </w:pPr>
-      <w:r>
-        <w:rPr>
-          <w:b/>
-          <w:bCs/>
-          <w:sz w:val="22"/>
-          <w:szCs w:val="22"/>
-        </w:rPr>
-        <w:t>Neumont University</w:t>
-      </w:r>
-      <w:r>
-        <w:rPr>
-          <w:color w:val="444444"/>
-        </w:rPr>
-        <w:tab/>
-        <w:t>Salt Lake City, UT</w:t>
-      </w:r>
-    </w:p>
-    <w:p>
-      <w:pPr>
-        <w:tabs>
-          <w:tab w:val="right" w:pos="9360"/>
-        </w:tabs>
-        <w:spacing w:after="80"/>
-      </w:pPr>
-      <w:r>
-        <w:t xml:space="preserve">    B.S. Computer Science</w:t>
-      </w:r>
-      <w:r>
-        <w:rPr>
-          <w:color w:val="444444"/>
-        </w:rPr>
-        <w:tab/>
-        <w:t>01/2007 – 09/2008</w:t>
-      </w:r>
-    </w:p>
-    <w:p>
-      <w:pPr>
-        <w:tabs>
-          <w:tab w:val="right" w:pos="9360"/>
-        </w:tabs>
-        <w:spacing w:before="80" w:after="20"/>
-      </w:pPr>
-      <w:r>
-        <w:rPr>
-          <w:b/>
-          <w:bCs/>
-          <w:sz w:val="22"/>
-          <w:szCs w:val="22"/>
-        </w:rPr>
-        <w:t>Utah Valley University</w:t>
-      </w:r>
-      <w:r>
-        <w:rPr>
-          <w:color w:val="444444"/>
-        </w:rPr>
-        <w:tab/>
-        <w:t>Orem, UT</w:t>
-      </w:r>
-    </w:p>
-    <w:p>
-      <w:pPr>
-        <w:tabs>
-          <w:tab w:val="right" w:pos="9360"/>
-        </w:tabs>
-        <w:spacing w:after="80"/>
-      </w:pPr>
-      <w:r>
-        <w:t xml:space="preserve">    A.A.S. Mathematics Education</w:t>
-      </w:r>
-      <w:r>
-        <w:rPr>
-          <w:color w:val="444444"/>
-        </w:rPr>
-        <w:tab/>
-        <w:t>03/2004 – 12/2006</w:t>
+        <w:rPr>
+          <w:sz w:val="22"/>
+          <w:szCs w:val="22"/>
+        </w:rPr>
+      </w:pPr>
+      <w:proofErr w:type="spellStart"/>
+      <w:r>
+        <w:rPr>
+          <w:b/>
+          <w:bCs/>
+          <w:sz w:val="22"/>
+          <w:szCs w:val="22"/>
+        </w:rPr>
+        <w:t>Neumont</w:t>
+      </w:r>
+      <w:proofErr w:type="spellEnd"/>
+      <w:r>
+        <w:rPr>
+          <w:b/>
+          <w:bCs/>
+          <w:sz w:val="22"/>
+          <w:szCs w:val="22"/>
+        </w:rPr>
+        <w:t xml:space="preserve"> University</w:t>
+      </w:r>
+      <w:r>
+        <w:rPr>
+          <w:rStyle w:val="apple-converted-space"/>
+          <w:sz w:val="22"/>
+          <w:szCs w:val="22"/>
+        </w:rPr>
+        <w:t> </w:t>
+      </w:r>
+      <w:r>
+        <w:rPr>
+          <w:sz w:val="22"/>
+          <w:szCs w:val="22"/>
+        </w:rPr>
+        <w:t>| B.S. Computer Science | Salt Lake City, UT | 01/2007 - 09/2008</w:t>
       </w:r>
     </w:p>
     <w:sectPr>
@@ -828,6 +941,92 @@
     </w:lvl>
   </w:abstractNum>
   <w:abstractNum w:abstractNumId="1" w15:restartNumberingAfterBreak="0">
+    <w:nsid w:val="2CBB2DF9"/>
+    <w:multiLevelType w:val="hybridMultilevel"/>
+    <w:tmpl w:val="3DD20F04"/>
+    <w:lvl w:ilvl="0" w:tplc="49107794">
+      <w:start w:val="1"/>
+      <w:numFmt w:val="bullet"/>
+      <w:lvlText w:val="●"/>
+      <w:lvlJc w:val="left"/>
+      <w:pPr>
+        <w:ind w:left="720" w:hanging="360"/>
+      </w:pPr>
+    </w:lvl>
+    <w:lvl w:ilvl="1" w:tplc="016263BC">
+      <w:start w:val="1"/>
+      <w:numFmt w:val="bullet"/>
+      <w:lvlText w:val="○"/>
+      <w:lvlJc w:val="left"/>
+      <w:pPr>
+        <w:ind w:left="1440" w:hanging="360"/>
+      </w:pPr>
+    </w:lvl>
+    <w:lvl w:ilvl="2" w:tplc="B4FA743A">
+      <w:start w:val="1"/>
+      <w:numFmt w:val="bullet"/>
+      <w:lvlText w:val="■"/>
+      <w:lvlJc w:val="left"/>
+      <w:pPr>
+        <w:ind w:left="2160" w:hanging="360"/>
+      </w:pPr>
+    </w:lvl>
+    <w:lvl w:ilvl="3" w:tplc="65D4E664">
+      <w:start w:val="1"/>
+      <w:numFmt w:val="bullet"/>
+      <w:lvlText w:val="●"/>
+      <w:lvlJc w:val="left"/>
+      <w:pPr>
+        <w:ind w:left="2880" w:hanging="360"/>
+      </w:pPr>
+    </w:lvl>
+    <w:lvl w:ilvl="4" w:tplc="0B66C920">
+      <w:start w:val="1"/>
+      <w:numFmt w:val="bullet"/>
+      <w:lvlText w:val="○"/>
+      <w:lvlJc w:val="left"/>
+      <w:pPr>
+        <w:ind w:left="3600" w:hanging="360"/>
+      </w:pPr>
+    </w:lvl>
+    <w:lvl w:ilvl="5" w:tplc="5EF8D11E">
+      <w:start w:val="1"/>
+      <w:numFmt w:val="bullet"/>
+      <w:lvlText w:val="■"/>
+      <w:lvlJc w:val="left"/>
+      <w:pPr>
+        <w:ind w:left="4320" w:hanging="360"/>
+      </w:pPr>
+    </w:lvl>
+    <w:lvl w:ilvl="6" w:tplc="101C6598">
+      <w:start w:val="1"/>
+      <w:numFmt w:val="bullet"/>
+      <w:lvlText w:val="●"/>
+      <w:lvlJc w:val="left"/>
+      <w:pPr>
+        <w:ind w:left="5040" w:hanging="360"/>
+      </w:pPr>
+    </w:lvl>
+    <w:lvl w:ilvl="7" w:tplc="EAF2DBEA">
+      <w:start w:val="1"/>
+      <w:numFmt w:val="bullet"/>
+      <w:lvlText w:val="●"/>
+      <w:lvlJc w:val="left"/>
+      <w:pPr>
+        <w:ind w:left="5760" w:hanging="360"/>
+      </w:pPr>
+    </w:lvl>
+    <w:lvl w:ilvl="8" w:tplc="648E237C">
+      <w:start w:val="1"/>
+      <w:numFmt w:val="bullet"/>
+      <w:lvlText w:val="●"/>
+      <w:lvlJc w:val="left"/>
+      <w:pPr>
+        <w:ind w:left="6480" w:hanging="360"/>
+      </w:pPr>
+    </w:lvl>
+  </w:abstractNum>
+  <w:abstractNum w:abstractNumId="2" w15:restartNumberingAfterBreak="0">
     <w:nsid w:val="2E0062BC"/>
     <w:multiLevelType w:val="hybridMultilevel"/>
     <w:tmpl w:val="FE2A1A5A"/>
@@ -914,7 +1113,7 @@
     </w:lvl>
   </w:abstractNum>
   <w:num w:numId="1" w16cid:durableId="1870559669">
-    <w:abstractNumId w:val="1"/>
+    <w:abstractNumId w:val="2"/>
     <w:lvlOverride w:ilvl="0">
       <w:startOverride w:val="1"/>
     </w:lvlOverride>
@@ -927,6 +1126,12 @@
   </w:num>
   <w:num w:numId="3" w16cid:durableId="1548492254">
     <w:abstractNumId w:val="0"/>
+  </w:num>
+  <w:num w:numId="4" w16cid:durableId="1302417629">
+    <w:abstractNumId w:val="1"/>
+    <w:lvlOverride w:ilvl="0">
+      <w:startOverride w:val="1"/>
+    </w:lvlOverride>
   </w:num>
 </w:numbering>
 </file>
@@ -1520,6 +1725,11 @@
       <w:szCs w:val="20"/>
     </w:rPr>
   </w:style>
+  <w:style w:type="character" w:customStyle="1" w:styleId="apple-converted-space">
+    <w:name w:val="apple-converted-space"/>
+    <w:basedOn w:val="DefaultParagraphFont"/>
+    <w:rsid w:val="00407F93"/>
+  </w:style>
 </w:styles>
 </file>
 

</xml_diff>